<commit_message>
Solucion de error 500 y mapeo Idoneidad Experiencia y Tipo de Contrato
</commit_message>
<xml_diff>
--- a/plantillas/INVERSION_2_VERIFICACION_CUMPLIMIENTO.docx
+++ b/plantillas/INVERSION_2_VERIFICACION_CUMPLIMIENTO.docx
@@ -119,7 +119,25 @@
                 <w:sz w:val="24"/>
                 <w:szCs w:val="24"/>
               </w:rPr>
-              <w:t>{{NIVEL_CONTRATO}}</w:t>
+              <w:t>{{</w:t>
+            </w:r>
+            <w:r>
+              <w:rPr>
+                <w:rFonts w:ascii="Arial" w:eastAsia="Arial" w:hAnsi="Arial" w:cs="Arial"/>
+                <w:sz w:val="24"/>
+                <w:szCs w:val="24"/>
+              </w:rPr>
+              <w:t>TIPO_CONTRATO</w:t>
+            </w:r>
+            <w:bookmarkStart w:id="0" w:name="_GoBack"/>
+            <w:bookmarkEnd w:id="0"/>
+            <w:r>
+              <w:rPr>
+                <w:rFonts w:ascii="Arial" w:eastAsia="Arial" w:hAnsi="Arial" w:cs="Arial"/>
+                <w:sz w:val="24"/>
+                <w:szCs w:val="24"/>
+              </w:rPr>
+              <w:t>}}</w:t>
             </w:r>
           </w:p>
         </w:tc>
@@ -237,18 +255,7 @@
                 <w:szCs w:val="24"/>
                 <w:lang w:val="es-CO"/>
               </w:rPr>
-              <w:t>{{VALOR_CONTRATO_LETRAS}}m/cte  (</w:t>
-            </w:r>
-            <w:bookmarkStart w:id="0" w:name="_GoBack"/>
-            <w:bookmarkEnd w:id="0"/>
-            <w:r>
-              <w:rPr>
-                <w:rFonts w:ascii="Arial" w:eastAsia="Arial" w:hAnsi="Arial" w:cs="Arial"/>
-                <w:sz w:val="24"/>
-                <w:szCs w:val="24"/>
-                <w:lang w:val="es-CO"/>
-              </w:rPr>
-              <w:t>{{VALOR_CONTRATO}})</w:t>
+              <w:t>{{VALOR_CONTRATO_LETRAS}}m/cte  ({{VALOR_CONTRATO}})</w:t>
             </w:r>
           </w:p>
         </w:tc>
@@ -425,7 +432,25 @@
                 <w:szCs w:val="24"/>
                 <w:lang w:val="es-CO"/>
               </w:rPr>
-              <w:t>{{PERFIL_FORMACION}}</w:t>
+              <w:t>{{</w:t>
+            </w:r>
+            <w:r>
+              <w:rPr>
+                <w:rFonts w:ascii="Arial" w:eastAsia="Arial" w:hAnsi="Arial" w:cs="Arial"/>
+                <w:sz w:val="24"/>
+                <w:szCs w:val="24"/>
+                <w:lang w:val="es-CO"/>
+              </w:rPr>
+              <w:t>IDONEIDAD_FORMACION</w:t>
+            </w:r>
+            <w:r>
+              <w:rPr>
+                <w:rFonts w:ascii="Arial" w:eastAsia="Arial" w:hAnsi="Arial" w:cs="Arial"/>
+                <w:sz w:val="24"/>
+                <w:szCs w:val="24"/>
+                <w:lang w:val="es-CO"/>
+              </w:rPr>
+              <w:t>}}</w:t>
             </w:r>
           </w:p>
         </w:tc>
@@ -484,7 +509,25 @@
                 <w:szCs w:val="24"/>
                 <w:lang w:val="es-CO"/>
               </w:rPr>
-              <w:t>{{PERFIL_EXPERIENCIA}}</w:t>
+              <w:t>{{</w:t>
+            </w:r>
+            <w:r>
+              <w:rPr>
+                <w:rFonts w:ascii="Arial" w:eastAsia="Arial" w:hAnsi="Arial" w:cs="Arial"/>
+                <w:sz w:val="24"/>
+                <w:szCs w:val="24"/>
+                <w:lang w:val="es-CO"/>
+              </w:rPr>
+              <w:t>EXPERIENCIA_BASICA</w:t>
+            </w:r>
+            <w:r>
+              <w:rPr>
+                <w:rFonts w:ascii="Arial" w:eastAsia="Arial" w:hAnsi="Arial" w:cs="Arial"/>
+                <w:sz w:val="24"/>
+                <w:szCs w:val="24"/>
+                <w:lang w:val="es-CO"/>
+              </w:rPr>
+              <w:t>}}</w:t>
             </w:r>
           </w:p>
         </w:tc>
@@ -868,7 +911,25 @@
                 <w:szCs w:val="24"/>
                 <w:lang w:val="es-CO"/>
               </w:rPr>
-              <w:t>{{PERFIL_FORMACION}}</w:t>
+              <w:t>{{</w:t>
+            </w:r>
+            <w:r>
+              <w:rPr>
+                <w:rFonts w:ascii="Arial" w:eastAsia="Arial" w:hAnsi="Arial" w:cs="Arial"/>
+                <w:sz w:val="24"/>
+                <w:szCs w:val="24"/>
+                <w:lang w:val="es-CO"/>
+              </w:rPr>
+              <w:t>IDONEIDAD_DESCRIPCION</w:t>
+            </w:r>
+            <w:r>
+              <w:rPr>
+                <w:rFonts w:ascii="Arial" w:eastAsia="Arial" w:hAnsi="Arial" w:cs="Arial"/>
+                <w:sz w:val="24"/>
+                <w:szCs w:val="24"/>
+                <w:lang w:val="es-CO"/>
+              </w:rPr>
+              <w:t>}}</w:t>
             </w:r>
           </w:p>
         </w:tc>
@@ -967,7 +1028,25 @@
                 <w:szCs w:val="24"/>
                 <w:lang w:val="es-CO"/>
               </w:rPr>
-              <w:t>{{PERFIL_EXPERIENCIA}}</w:t>
+              <w:t>{{</w:t>
+            </w:r>
+            <w:r>
+              <w:rPr>
+                <w:rFonts w:ascii="Arial" w:eastAsia="Arial" w:hAnsi="Arial" w:cs="Arial"/>
+                <w:sz w:val="24"/>
+                <w:szCs w:val="24"/>
+                <w:lang w:val="es-CO"/>
+              </w:rPr>
+              <w:t>EXPERIENCIA_DESCRIPCION</w:t>
+            </w:r>
+            <w:r>
+              <w:rPr>
+                <w:rFonts w:ascii="Arial" w:eastAsia="Arial" w:hAnsi="Arial" w:cs="Arial"/>
+                <w:sz w:val="24"/>
+                <w:szCs w:val="24"/>
+                <w:lang w:val="es-CO"/>
+              </w:rPr>
+              <w:t>}}</w:t>
             </w:r>
           </w:p>
         </w:tc>
@@ -4520,6 +4599,15 @@
   <wne:recipientData>
     <wne:active wne:val="1"/>
   </wne:recipientData>
+  <wne:recipientData>
+    <wne:active wne:val="1"/>
+  </wne:recipientData>
+  <wne:recipientData>
+    <wne:active wne:val="1"/>
+  </wne:recipientData>
+  <wne:recipientData>
+    <wne:active wne:val="1"/>
+  </wne:recipientData>
 </wne:recipients>
 </file>
 
@@ -7552,7 +7640,7 @@
   <a:extraClrSchemeLst/>
   <a:extLst>
     <a:ext uri="{05A4C25C-085E-4340-85A3-A5531E510DB2}">
-      <thm15:themeFamily xmlns:thm15="http://schemas.microsoft.com/office/thememl/2012/main" xmlns="" name="Office Theme" id="{62F939B6-93AF-4DB8-9C6B-D6C7DFDC589F}" vid="{4A3C46E8-61CC-4603-A589-7422A47A8E4A}"/>
+      <thm15:themeFamily xmlns="" xmlns:thm15="http://schemas.microsoft.com/office/thememl/2012/main" name="Office Theme" id="{62F939B6-93AF-4DB8-9C6B-D6C7DFDC589F}" vid="{4A3C46E8-61CC-4603-A589-7422A47A8E4A}"/>
     </a:ext>
   </a:extLst>
 </a:theme>
@@ -7578,7 +7666,7 @@
 </file>
 
 <file path=customXml/itemProps2.xml><?xml version="1.0" encoding="utf-8"?>
-<ds:datastoreItem xmlns:ds="http://schemas.openxmlformats.org/officeDocument/2006/customXml" ds:itemID="{CD96D795-C5CC-413D-9236-E9E615CD4197}">
+<ds:datastoreItem xmlns:ds="http://schemas.openxmlformats.org/officeDocument/2006/customXml" ds:itemID="{0A285C99-D521-4110-97B1-851106EC1924}">
   <ds:schemaRefs>
     <ds:schemaRef ds:uri="http://schemas.openxmlformats.org/officeDocument/2006/bibliography"/>
   </ds:schemaRefs>

</xml_diff>